<commit_message>
Address reviewer checklist: disclose ADWIN simplification and statistical power limit
Section V-C now states the ADWIN implementation is a simplified
exponential-histogram variant, not the full original algorithm. Sections X
and XVII now explicitly flag that n=10 seeds gives limited statistical
power, so non-significant Wilcoxon results should not be read as proof of
equivalence.

Co-Authored-By: Claude Sonnet 5 <noreply@anthropic.com>
</commit_message>
<xml_diff>
--- a/paper/Self_Healing_ML_Pipeline_IEEE.docx
+++ b/paper/Self_Healing_ML_Pipeline_IEEE.docx
@@ -2819,7 +2819,7 @@
           <w:i w:val="0"/>
           <w:sz w:val="20"/>
         </w:rPr>
-        <w:t>DDM [1] tracks the online error rate and its standard deviation. EDDM [2] tracks the distance between consecutive misclassifications. ADWIN [3] maintains a variable-length window compressed with an exponential histogram and applies a Hoeffding-bound cut-point test. KSWIN [4] applies a two-sample KS test between sub-windows of a sliding window. All four were implemented from scratch (numpy/scipy only) so cost instrumentation and hot-swap retraining integrate directly into the online serving loop.</w:t>
+        <w:t>DDM [1] tracks the online error rate and its standard deviation. EDDM [2] tracks the distance between consecutive misclassifications. ADWIN [3] maintains a variable-length window compressed with an exponential histogram and applies a Hoeffding-bound cut-point test. KSWIN [4] applies a two-sample KS test between sub-windows of a sliding window. All four were implemented from scratch (numpy/scipy only) so cost instrumentation and hot-swap retraining integrate directly into the online serving loop. The ADWIN implementation used here is a simplified exponential-histogram variant with a fixed bucket-merge factor (max 5 buckets per capacity level) rather than the full data-structure and cut-point search of the original algorithm [3]; this bounds memory and keeps the amortised complexity in Section XV, but the reported ADWIN results should be read as reflecting this specific implementation, not a re-derivation of the original paper's guarantees.</w:t>
       </w:r>
     </w:p>
     <w:p>
@@ -9191,6 +9191,22 @@
           <w:sz w:val="20"/>
         </w:rPr>
         <w:t>All comparative claims in Sections VIII-IX are based on 10 independent seeds per condition (10 for the detector comparison and ablation alike), with paired Wilcoxon signed-rank tests at alpha = 0.05 rather than a single-run difference. Standard deviations reported throughout Tables V and VII show that variance is non-trivial -- e.g. ADWIN's cost standard deviation on SEA (0.408) exceeds its mean (0.284), reflecting that the number of triggered retrains varies considerably across seeds under abrupt drift. This variance is itself a finding: a detector's cost is not a fixed number but a distribution, and reporting only a mean would understate the operational uncertainty an operator should budget for.</w:t>
+      </w:r>
+    </w:p>
+    <w:p>
+      <w:pPr>
+        <w:spacing w:before="0" w:after="20" w:line="240" w:lineRule="auto"/>
+        <w:ind w:firstLine="288"/>
+        <w:jc w:val="both"/>
+      </w:pPr>
+      <w:r>
+        <w:rPr>
+          <w:rFonts w:ascii="Times New Roman" w:hAnsi="Times New Roman"/>
+          <w:b w:val="0"/>
+          <w:i w:val="0"/>
+          <w:sz w:val="20"/>
+        </w:rPr>
+        <w:t>A caveat applies to every 'not significant' result in Table VI: with only 10 paired seeds, the Wilcoxon signed-rank test has limited statistical power, particularly for the small- and medium-sized accuracy differences seen on the SEA stream. A non-significant result here should be read as 'not distinguishable at this sample size,' not as evidence that the two detectors are truly equivalent; some of these null results may be false negatives rather than true null effects. Section XVII returns to this as a limitation on the paper's negative findings specifically.</w:t>
       </w:r>
     </w:p>
     <w:p>
@@ -9786,6 +9802,22 @@
           <w:sz w:val="20"/>
         </w:rPr>
         <w:t>XVII.  LIMITATIONS</w:t>
+      </w:r>
+    </w:p>
+    <w:p>
+      <w:pPr>
+        <w:spacing w:before="0" w:after="20" w:line="240" w:lineRule="auto"/>
+        <w:ind w:firstLine="288"/>
+        <w:jc w:val="both"/>
+      </w:pPr>
+      <w:r>
+        <w:rPr>
+          <w:rFonts w:ascii="Times New Roman" w:hAnsi="Times New Roman"/>
+          <w:b w:val="0"/>
+          <w:i w:val="0"/>
+          <w:sz w:val="20"/>
+        </w:rPr>
+        <w:t>Statistical power: with 10 seeds per condition, the paired significance tests in Table VI are underpowered for small effect sizes (Section X); several 'not significant' results, particularly on the SEA stream, may reflect insufficient sample size rather than a true absence of difference, and should not be read as proof of equivalence. ADWIN implementation: results for ADWIN reflect the simplified exponential-histogram variant described in Section V-C, not a re-implementation of the original algorithm's full data structure.</w:t>
       </w:r>
     </w:p>
     <w:p>

</xml_diff>